<commit_message>
Ragione sociale organizzatore dell'evento usata nei PDF contrattuali: se compilata sostituisce il nome VALET nei template (contratto, domanda, ECM/non-ECM), se vuota resta la dicitura standard; help text e manuali aggiornati, 3 test nuovi
</commit_message>
<xml_diff>
--- a/contracts/templates_pdf/template_contratto_sponsor_non_ecm_en.docx
+++ b/contracts/templates_pdf/template_contratto_sponsor_non_ecm_en.docx
@@ -76,7 +76,7 @@
           <w:rFonts w:cs="Arial" w:ascii="Arial" w:hAnsi="Arial"/>
           <w:sz w:val="18"/>
         </w:rPr>
-        <w:t xml:space="preserve">Company VALET SRL, with registered office in Bologna,</w:t>
+        <w:t xml:space="preserve">Company {{ organizer_name or "VALET SRL" }}, with registered office in Bologna,</w:t>
       </w:r>
       <w:r>
         <w:rPr>
@@ -3627,7 +3627,7 @@
                 <w:rFonts w:cs="Arial" w:ascii="Arial" w:hAnsi="Arial"/>
                 <w:sz w:val="18"/>
               </w:rPr>
-              <w:t xml:space="preserve">VALET SRL </w:t>
+              <w:t xml:space="preserve">{{ organizer_name or "VALET SRL" }} </w:t>
             </w:r>
           </w:p>
           <w:p>

</xml_diff>

<commit_message>
Contratti: campo "Vostro riferimento (PO)" stampato su preventivo, contratto e domanda
Alcune aziende chiedono che sui documenti compaia un loro riferimento
(numero d'ordine d'acquisto, CIG, commessa); altre non ne hanno alcuno.

Il contratto ha ora un campo facoltativo "Vostro riferimento (PO)". Se
compilato, viene stampato come "Vostro riferimento: ..." (in inglese
"Your reference: ...") in testa al preventivo PDF, al contratto di
sponsorizzazione ECM e non-ECM e alla domanda di ammissione. Se resta
vuoto non compare nulla: nessuna etichetta orfana, nessuna riga vuota.

Nei sei template Word il blocco e' condizionale, con lo stesso schema
gia' usato per l'Allegato 1.

15 test nuovi (i sei template renderizzati con e senza riferimento, piu'
il preventivo HTML), suite completa 483 verdi.
</commit_message>
<xml_diff>
--- a/contracts/templates_pdf/template_contratto_sponsor_non_ecm_en.docx
+++ b/contracts/templates_pdf/template_contratto_sponsor_non_ecm_en.docx
@@ -19,6 +19,49 @@
           <w:sz w:val="18"/>
         </w:rPr>
         <w:t xml:space="preserve">SPONSORSHIP AGREEMENT Non-ECM Event</w:t>
+      </w:r>
+    </w:p>
+    <w:p>
+      <w:pPr>
+        <w:spacing w:before="40" w:after="40"/>
+      </w:pPr>
+      <w:r>
+        <w:rPr>
+          <w:b w:val="0"/>
+          <w:sz w:val="20"/>
+        </w:rPr>
+        <w:t>{%p if contract.customer_reference %}</w:t>
+      </w:r>
+    </w:p>
+    <w:p>
+      <w:pPr>
+        <w:spacing w:before="40" w:after="40"/>
+      </w:pPr>
+      <w:r>
+        <w:rPr>
+          <w:b/>
+          <w:sz w:val="20"/>
+        </w:rPr>
+        <w:t xml:space="preserve">Your reference: </w:t>
+      </w:r>
+      <w:r>
+        <w:rPr>
+          <w:b w:val="0"/>
+          <w:sz w:val="20"/>
+        </w:rPr>
+        <w:t>{{ contract.customer_reference }}</w:t>
+      </w:r>
+    </w:p>
+    <w:p>
+      <w:pPr>
+        <w:spacing w:before="40" w:after="40"/>
+      </w:pPr>
+      <w:r>
+        <w:rPr>
+          <w:b w:val="0"/>
+          <w:sz w:val="20"/>
+        </w:rPr>
+        <w:t>{%p endif %}</w:t>
       </w:r>
     </w:p>
     <w:p>

</xml_diff>